<commit_message>
Raise the fairing separation altitude (more realistic)
</commit_message>
<xml_diff>
--- a/Documentation/docx/English-Documentation.docx
+++ b/Documentation/docx/English-Documentation.docx
@@ -17,8 +17,6 @@
           <w:sz w:val="28"/>
         </w:rPr>
       </w:pPr>
-      <w:bookmarkStart w:id="0" w:name="_GoBack"/>
-      <w:bookmarkEnd w:id="0"/>
       <w:r>
         <w:rPr>
           <w:noProof/>
@@ -297,7 +295,21 @@
               <w:rPr>
                 <w:sz w:val="28"/>
               </w:rPr>
-              <w:t xml:space="preserve">Victor Slavutinsky, </w:t>
+              <w:t xml:space="preserve">Victor </w:t>
+            </w:r>
+            <w:proofErr w:type="spellStart"/>
+            <w:r>
+              <w:rPr>
+                <w:sz w:val="28"/>
+              </w:rPr>
+              <w:t>Slavutinsky</w:t>
+            </w:r>
+            <w:proofErr w:type="spellEnd"/>
+            <w:r>
+              <w:rPr>
+                <w:sz w:val="28"/>
+              </w:rPr>
+              <w:t xml:space="preserve">, </w:t>
             </w:r>
             <w:r>
               <w:rPr>
@@ -2065,7 +2077,21 @@
               <w:rPr>
                 <w:sz w:val="28"/>
               </w:rPr>
-              <w:t>Blocks A, B, C, D: blocks of first stage clockwise by forward block.</w:t>
+              <w:t xml:space="preserve">Blocks A, B, C, </w:t>
+            </w:r>
+            <w:proofErr w:type="gramStart"/>
+            <w:r>
+              <w:rPr>
+                <w:sz w:val="28"/>
+              </w:rPr>
+              <w:t>D</w:t>
+            </w:r>
+            <w:proofErr w:type="gramEnd"/>
+            <w:r>
+              <w:rPr>
+                <w:sz w:val="28"/>
+              </w:rPr>
+              <w:t>: blocks of first stage clockwise by forward block.</w:t>
             </w:r>
           </w:p>
           <w:p>
@@ -2791,7 +2817,21 @@
         <w:rPr>
           <w:sz w:val="28"/>
         </w:rPr>
-        <w:t>Block A engine functioning lamp</w:t>
+        <w:t xml:space="preserve">Block </w:t>
+      </w:r>
+      <w:proofErr w:type="gramStart"/>
+      <w:r>
+        <w:rPr>
+          <w:sz w:val="28"/>
+        </w:rPr>
+        <w:t>A</w:t>
+      </w:r>
+      <w:proofErr w:type="gramEnd"/>
+      <w:r>
+        <w:rPr>
+          <w:sz w:val="28"/>
+        </w:rPr>
+        <w:t xml:space="preserve"> engine functioning lamp</w:t>
       </w:r>
     </w:p>
     <w:p>
@@ -3653,7 +3693,21 @@
         <w:rPr>
           <w:sz w:val="28"/>
         </w:rPr>
-        <w:t>Х10 000 kilometers/hour. Notice what it shows speed about 1000km/h while rocket is stays on the ground. It's Earth rotation speed what's added. Because Earth is rotated from west to east flight gotta be conducted in opposite direction. Otherwise it's subtracted instead of added and amount of fuel could become too small for orbital speed reaching.</w:t>
+        <w:t xml:space="preserve">Х10 000 kilometers/hour. Notice what it shows speed about 1000km/h while rocket is stays on the ground. </w:t>
+      </w:r>
+      <w:proofErr w:type="gramStart"/>
+      <w:r>
+        <w:rPr>
+          <w:sz w:val="28"/>
+        </w:rPr>
+        <w:t>It's</w:t>
+      </w:r>
+      <w:proofErr w:type="gramEnd"/>
+      <w:r>
+        <w:rPr>
+          <w:sz w:val="28"/>
+        </w:rPr>
+        <w:t xml:space="preserve"> Earth rotation speed what's added. Because Earth is rotated from west to east flight gotta be conducted in opposite direction. Otherwise it's subtracted instead of added and amount of fuel could become too small for orbital speed reaching.</w:t>
       </w:r>
     </w:p>
     <w:p>
@@ -4079,7 +4133,21 @@
         <w:rPr>
           <w:sz w:val="28"/>
         </w:rPr>
-        <w:t>In case of automatic orientation system malfunction visual orientation for deorbit burn is possible. Orientate spacecraft manually to put reflection of underling Earth surface in center of “Vzor” round mittor. Running of Earth surface must</w:t>
+        <w:t xml:space="preserve">In case of automatic orientation system malfunction visual orientation for deorbit burn is possible. Orientate spacecraft manually to put reflection of underling Earth surface in center of “Vzor” round </w:t>
+      </w:r>
+      <w:proofErr w:type="spellStart"/>
+      <w:r>
+        <w:rPr>
+          <w:sz w:val="28"/>
+        </w:rPr>
+        <w:t>mittor</w:t>
+      </w:r>
+      <w:proofErr w:type="spellEnd"/>
+      <w:r>
+        <w:rPr>
+          <w:sz w:val="28"/>
+        </w:rPr>
+        <w:t>. Running of Earth surface must</w:t>
       </w:r>
       <w:r>
         <w:rPr>
@@ -4940,7 +5008,21 @@
         <w:rPr>
           <w:sz w:val="28"/>
         </w:rPr>
-        <w:t xml:space="preserve">Switched on by c button pressing. On going to orbit and first three stages activity phase pressing on it stabilizes and holds carrier in angles what if has on moment of pressing.  On orbital TDU activity phase pressing activates </w:t>
+        <w:t xml:space="preserve">Switched on by c button pressing. </w:t>
+      </w:r>
+      <w:proofErr w:type="spellStart"/>
+      <w:r>
+        <w:rPr>
+          <w:sz w:val="28"/>
+        </w:rPr>
+        <w:t>On going</w:t>
+      </w:r>
+      <w:proofErr w:type="spellEnd"/>
+      <w:r>
+        <w:rPr>
+          <w:sz w:val="28"/>
+        </w:rPr>
+        <w:t xml:space="preserve"> to orbit and first three stages activity phase pressing on it stabilizes and holds carrier in angles what if has on moment of pressing.  On orbital TDU activity phase pressing activates </w:t>
       </w:r>
       <w:r>
         <w:rPr>
@@ -5028,7 +5110,35 @@
         <w:rPr>
           <w:sz w:val="28"/>
         </w:rPr>
-        <w:t>yaw. If You have no joystick then keyboard with NumLock switched on is preferable for control. Then keys 8 and 2 controls pitch, 4 and 6 contr</w:t>
+        <w:t xml:space="preserve">yaw. If </w:t>
+      </w:r>
+      <w:proofErr w:type="gramStart"/>
+      <w:r>
+        <w:rPr>
+          <w:sz w:val="28"/>
+        </w:rPr>
+        <w:t>You</w:t>
+      </w:r>
+      <w:proofErr w:type="gramEnd"/>
+      <w:r>
+        <w:rPr>
+          <w:sz w:val="28"/>
+        </w:rPr>
+        <w:t xml:space="preserve"> have no joystick then keyboard with </w:t>
+      </w:r>
+      <w:proofErr w:type="spellStart"/>
+      <w:r>
+        <w:rPr>
+          <w:sz w:val="28"/>
+        </w:rPr>
+        <w:t>NumLock</w:t>
+      </w:r>
+      <w:proofErr w:type="spellEnd"/>
+      <w:r>
+        <w:rPr>
+          <w:sz w:val="28"/>
+        </w:rPr>
+        <w:t xml:space="preserve"> switched on is preferable for control. Then keys 8 and 2 controls pitch, 4 and 6 contr</w:t>
       </w:r>
       <w:r>
         <w:rPr>
@@ -7809,240 +7919,6 @@
     </w:p>
     <w:p>
       <w:pPr>
-        <w:numPr>
-          <w:ilvl w:val="0"/>
-          <w:numId w:val="11"/>
-        </w:numPr>
-        <w:pBdr>
-          <w:top w:val="none" w:sz="0" w:space="0" w:color="auto"/>
-          <w:left w:val="none" w:sz="0" w:space="0" w:color="auto"/>
-          <w:bottom w:val="none" w:sz="0" w:space="0" w:color="auto"/>
-          <w:right w:val="none" w:sz="0" w:space="0" w:color="auto"/>
-        </w:pBdr>
-        <w:shd w:val="clear" w:color="auto" w:fill="auto"/>
-        <w:spacing w:after="83" w:line="259" w:lineRule="auto"/>
-        <w:ind w:hanging="360"/>
-        <w:rPr>
-          <w:sz w:val="28"/>
-        </w:rPr>
-      </w:pPr>
-      <w:r>
-        <w:rPr>
-          <w:sz w:val="28"/>
-        </w:rPr>
-        <w:t>Unlock throttle handle</w:t>
-      </w:r>
-    </w:p>
-    <w:p>
-      <w:pPr>
-        <w:numPr>
-          <w:ilvl w:val="0"/>
-          <w:numId w:val="11"/>
-        </w:numPr>
-        <w:pBdr>
-          <w:top w:val="none" w:sz="0" w:space="0" w:color="auto"/>
-          <w:left w:val="none" w:sz="0" w:space="0" w:color="auto"/>
-          <w:bottom w:val="none" w:sz="0" w:space="0" w:color="auto"/>
-          <w:right w:val="none" w:sz="0" w:space="0" w:color="auto"/>
-        </w:pBdr>
-        <w:shd w:val="clear" w:color="auto" w:fill="auto"/>
-        <w:spacing w:after="83" w:line="259" w:lineRule="auto"/>
-        <w:ind w:hanging="360"/>
-        <w:rPr>
-          <w:sz w:val="28"/>
-        </w:rPr>
-      </w:pPr>
-      <w:r>
-        <w:rPr>
-          <w:sz w:val="28"/>
-        </w:rPr>
-        <w:t>Open right panel and ignite first two stages.</w:t>
-      </w:r>
-    </w:p>
-    <w:p>
-      <w:pPr>
-        <w:numPr>
-          <w:ilvl w:val="0"/>
-          <w:numId w:val="11"/>
-        </w:numPr>
-        <w:pBdr>
-          <w:top w:val="none" w:sz="0" w:space="0" w:color="auto"/>
-          <w:left w:val="none" w:sz="0" w:space="0" w:color="auto"/>
-          <w:bottom w:val="none" w:sz="0" w:space="0" w:color="auto"/>
-          <w:right w:val="none" w:sz="0" w:space="0" w:color="auto"/>
-        </w:pBdr>
-        <w:shd w:val="clear" w:color="auto" w:fill="auto"/>
-        <w:spacing w:after="83" w:line="259" w:lineRule="auto"/>
-        <w:ind w:hanging="360"/>
-        <w:rPr>
-          <w:sz w:val="28"/>
-        </w:rPr>
-      </w:pPr>
-      <w:r>
-        <w:rPr>
-          <w:sz w:val="28"/>
-        </w:rPr>
-        <w:t>Maximize throttle.</w:t>
-      </w:r>
-    </w:p>
-    <w:p>
-      <w:pPr>
-        <w:numPr>
-          <w:ilvl w:val="0"/>
-          <w:numId w:val="11"/>
-        </w:numPr>
-        <w:pBdr>
-          <w:top w:val="none" w:sz="0" w:space="0" w:color="auto"/>
-          <w:left w:val="none" w:sz="0" w:space="0" w:color="auto"/>
-          <w:bottom w:val="none" w:sz="0" w:space="0" w:color="auto"/>
-          <w:right w:val="none" w:sz="0" w:space="0" w:color="auto"/>
-        </w:pBdr>
-        <w:shd w:val="clear" w:color="auto" w:fill="auto"/>
-        <w:spacing w:after="83" w:line="259" w:lineRule="auto"/>
-        <w:ind w:hanging="360"/>
-        <w:rPr>
-          <w:sz w:val="28"/>
-        </w:rPr>
-      </w:pPr>
-      <w:r>
-        <w:rPr>
-          <w:sz w:val="28"/>
-        </w:rPr>
-        <w:t>On 100m altitude reach begin rotation by compass to north-east direction, 55 degrees.</w:t>
-      </w:r>
-    </w:p>
-    <w:p>
-      <w:pPr>
-        <w:numPr>
-          <w:ilvl w:val="0"/>
-          <w:numId w:val="11"/>
-        </w:numPr>
-        <w:pBdr>
-          <w:top w:val="none" w:sz="0" w:space="0" w:color="auto"/>
-          <w:left w:val="none" w:sz="0" w:space="0" w:color="auto"/>
-          <w:bottom w:val="none" w:sz="0" w:space="0" w:color="auto"/>
-          <w:right w:val="none" w:sz="0" w:space="0" w:color="auto"/>
-        </w:pBdr>
-        <w:shd w:val="clear" w:color="auto" w:fill="auto"/>
-        <w:spacing w:after="83" w:line="259" w:lineRule="auto"/>
-        <w:ind w:hanging="360"/>
-        <w:rPr>
-          <w:sz w:val="28"/>
-        </w:rPr>
-      </w:pPr>
-      <w:r>
-        <w:rPr>
-          <w:sz w:val="28"/>
-        </w:rPr>
-        <w:t>On end of turning stabilize carrier and put nose down on 30 degrees by pitch.</w:t>
-      </w:r>
-    </w:p>
-    <w:p>
-      <w:pPr>
-        <w:numPr>
-          <w:ilvl w:val="0"/>
-          <w:numId w:val="11"/>
-        </w:numPr>
-        <w:pBdr>
-          <w:top w:val="none" w:sz="0" w:space="0" w:color="auto"/>
-          <w:left w:val="none" w:sz="0" w:space="0" w:color="auto"/>
-          <w:bottom w:val="none" w:sz="0" w:space="0" w:color="auto"/>
-          <w:right w:val="none" w:sz="0" w:space="0" w:color="auto"/>
-        </w:pBdr>
-        <w:shd w:val="clear" w:color="auto" w:fill="auto"/>
-        <w:spacing w:after="83" w:line="259" w:lineRule="auto"/>
-        <w:ind w:hanging="360"/>
-        <w:rPr>
-          <w:sz w:val="28"/>
-        </w:rPr>
-      </w:pPr>
-      <w:r>
-        <w:rPr>
-          <w:sz w:val="28"/>
-        </w:rPr>
-        <w:t>Look on dynamic pressure indicator from time to time and reduce thrust to keep pressure below 5 tons/square meter limit.</w:t>
-      </w:r>
-    </w:p>
-    <w:p>
-      <w:pPr>
-        <w:numPr>
-          <w:ilvl w:val="0"/>
-          <w:numId w:val="11"/>
-        </w:numPr>
-        <w:pBdr>
-          <w:top w:val="none" w:sz="0" w:space="0" w:color="auto"/>
-          <w:left w:val="none" w:sz="0" w:space="0" w:color="auto"/>
-          <w:bottom w:val="none" w:sz="0" w:space="0" w:color="auto"/>
-          <w:right w:val="none" w:sz="0" w:space="0" w:color="auto"/>
-        </w:pBdr>
-        <w:shd w:val="clear" w:color="auto" w:fill="auto"/>
-        <w:spacing w:after="83" w:line="259" w:lineRule="auto"/>
-        <w:ind w:hanging="360"/>
-        <w:rPr>
-          <w:sz w:val="28"/>
-        </w:rPr>
-      </w:pPr>
-      <w:r>
-        <w:rPr>
-          <w:sz w:val="28"/>
-        </w:rPr>
-        <w:t>Restore thrust with pressure dropping.</w:t>
-      </w:r>
-    </w:p>
-    <w:p>
-      <w:pPr>
-        <w:numPr>
-          <w:ilvl w:val="0"/>
-          <w:numId w:val="11"/>
-        </w:numPr>
-        <w:pBdr>
-          <w:top w:val="none" w:sz="0" w:space="0" w:color="auto"/>
-          <w:left w:val="none" w:sz="0" w:space="0" w:color="auto"/>
-          <w:bottom w:val="none" w:sz="0" w:space="0" w:color="auto"/>
-          <w:right w:val="none" w:sz="0" w:space="0" w:color="auto"/>
-        </w:pBdr>
-        <w:shd w:val="clear" w:color="auto" w:fill="auto"/>
-        <w:spacing w:after="83" w:line="259" w:lineRule="auto"/>
-        <w:ind w:hanging="360"/>
-        <w:rPr>
-          <w:sz w:val="28"/>
-        </w:rPr>
-      </w:pPr>
-      <w:r>
-        <w:rPr>
-          <w:sz w:val="28"/>
-        </w:rPr>
-        <w:t>Continue ascent with pitch angle growing by small amounts continuing for 500m/sec vertical speed stabilizing.</w:t>
-      </w:r>
-    </w:p>
-    <w:p>
-      <w:pPr>
-        <w:numPr>
-          <w:ilvl w:val="0"/>
-          <w:numId w:val="11"/>
-        </w:numPr>
-        <w:pBdr>
-          <w:top w:val="none" w:sz="0" w:space="0" w:color="auto"/>
-          <w:left w:val="none" w:sz="0" w:space="0" w:color="auto"/>
-          <w:bottom w:val="none" w:sz="0" w:space="0" w:color="auto"/>
-          <w:right w:val="none" w:sz="0" w:space="0" w:color="auto"/>
-        </w:pBdr>
-        <w:shd w:val="clear" w:color="auto" w:fill="auto"/>
-        <w:spacing w:after="83" w:line="259" w:lineRule="auto"/>
-        <w:ind w:hanging="360"/>
-        <w:rPr>
-          <w:sz w:val="28"/>
-        </w:rPr>
-      </w:pPr>
-      <w:r>
-        <w:rPr>
-          <w:sz w:val="28"/>
-        </w:rPr>
-        <w:t>Correct yaw angle on need.</w:t>
-      </w:r>
-    </w:p>
-    <w:p>
-      <w:pPr>
         <w:pBdr>
           <w:top w:val="none" w:sz="0" w:space="0" w:color="auto"/>
           <w:left w:val="none" w:sz="0" w:space="0" w:color="auto"/>
@@ -8060,7 +7936,7 @@
         <w:rPr>
           <w:sz w:val="28"/>
         </w:rPr>
-        <w:t>10.</w:t>
+        <w:t xml:space="preserve">1. </w:t>
       </w:r>
       <w:r>
         <w:rPr>
@@ -8068,11 +7944,13 @@
         </w:rPr>
         <w:t xml:space="preserve"> </w:t>
       </w:r>
-      <w:r>
-        <w:rPr>
-          <w:sz w:val="28"/>
-        </w:rPr>
-        <w:t xml:space="preserve">Check g force indicator and control throttle to preserve g force 4g limit exceeding. </w:t>
+      <w:bookmarkStart w:id="0" w:name="_GoBack"/>
+      <w:bookmarkEnd w:id="0"/>
+      <w:r>
+        <w:rPr>
+          <w:sz w:val="28"/>
+        </w:rPr>
+        <w:t>Unlock throttle handle</w:t>
       </w:r>
     </w:p>
     <w:p>
@@ -8094,7 +7972,7 @@
         <w:rPr>
           <w:sz w:val="28"/>
         </w:rPr>
-        <w:t>11.</w:t>
+        <w:t xml:space="preserve">2. </w:t>
       </w:r>
       <w:r>
         <w:rPr>
@@ -8106,19 +7984,7 @@
         <w:rPr>
           <w:sz w:val="28"/>
         </w:rPr>
-        <w:t>Separate fair</w:t>
-      </w:r>
-      <w:r>
-        <w:rPr>
-          <w:sz w:val="28"/>
-        </w:rPr>
-        <w:t>ings on 50km altitude exceeding</w:t>
-      </w:r>
-      <w:r>
-        <w:rPr>
-          <w:sz w:val="28"/>
-        </w:rPr>
-        <w:t>.</w:t>
+        <w:t>Open right panel and ignite first two stages.</w:t>
       </w:r>
     </w:p>
     <w:p>
@@ -8140,6 +8006,312 @@
         <w:rPr>
           <w:sz w:val="28"/>
         </w:rPr>
+        <w:t xml:space="preserve">3. </w:t>
+      </w:r>
+      <w:r>
+        <w:rPr>
+          <w:sz w:val="28"/>
+        </w:rPr>
+        <w:t xml:space="preserve"> </w:t>
+      </w:r>
+      <w:r>
+        <w:rPr>
+          <w:sz w:val="28"/>
+        </w:rPr>
+        <w:t>Maximize throttle.</w:t>
+      </w:r>
+    </w:p>
+    <w:p>
+      <w:pPr>
+        <w:pBdr>
+          <w:top w:val="none" w:sz="0" w:space="0" w:color="auto"/>
+          <w:left w:val="none" w:sz="0" w:space="0" w:color="auto"/>
+          <w:bottom w:val="none" w:sz="0" w:space="0" w:color="auto"/>
+          <w:right w:val="none" w:sz="0" w:space="0" w:color="auto"/>
+        </w:pBdr>
+        <w:shd w:val="clear" w:color="auto" w:fill="auto"/>
+        <w:spacing w:after="83" w:line="259" w:lineRule="auto"/>
+        <w:ind w:left="355"/>
+        <w:rPr>
+          <w:sz w:val="28"/>
+        </w:rPr>
+      </w:pPr>
+      <w:r>
+        <w:rPr>
+          <w:sz w:val="28"/>
+        </w:rPr>
+        <w:t xml:space="preserve">4. </w:t>
+      </w:r>
+      <w:r>
+        <w:rPr>
+          <w:sz w:val="28"/>
+        </w:rPr>
+        <w:t xml:space="preserve"> </w:t>
+      </w:r>
+      <w:r>
+        <w:rPr>
+          <w:sz w:val="28"/>
+        </w:rPr>
+        <w:t>On 100m altitude reach begin rotation by compass to north-east direction, 55 degrees.</w:t>
+      </w:r>
+    </w:p>
+    <w:p>
+      <w:pPr>
+        <w:pBdr>
+          <w:top w:val="none" w:sz="0" w:space="0" w:color="auto"/>
+          <w:left w:val="none" w:sz="0" w:space="0" w:color="auto"/>
+          <w:bottom w:val="none" w:sz="0" w:space="0" w:color="auto"/>
+          <w:right w:val="none" w:sz="0" w:space="0" w:color="auto"/>
+        </w:pBdr>
+        <w:shd w:val="clear" w:color="auto" w:fill="auto"/>
+        <w:spacing w:after="83" w:line="259" w:lineRule="auto"/>
+        <w:ind w:left="355"/>
+        <w:rPr>
+          <w:sz w:val="28"/>
+        </w:rPr>
+      </w:pPr>
+      <w:r>
+        <w:rPr>
+          <w:sz w:val="28"/>
+        </w:rPr>
+        <w:t xml:space="preserve">5. </w:t>
+      </w:r>
+      <w:r>
+        <w:rPr>
+          <w:sz w:val="28"/>
+        </w:rPr>
+        <w:t xml:space="preserve"> </w:t>
+      </w:r>
+      <w:r>
+        <w:rPr>
+          <w:sz w:val="28"/>
+        </w:rPr>
+        <w:t>On end of turning stabilize carrier and put nose down on 30 degrees by pitch.</w:t>
+      </w:r>
+    </w:p>
+    <w:p>
+      <w:pPr>
+        <w:pBdr>
+          <w:top w:val="none" w:sz="0" w:space="0" w:color="auto"/>
+          <w:left w:val="none" w:sz="0" w:space="0" w:color="auto"/>
+          <w:bottom w:val="none" w:sz="0" w:space="0" w:color="auto"/>
+          <w:right w:val="none" w:sz="0" w:space="0" w:color="auto"/>
+        </w:pBdr>
+        <w:shd w:val="clear" w:color="auto" w:fill="auto"/>
+        <w:spacing w:after="83" w:line="259" w:lineRule="auto"/>
+        <w:ind w:left="355"/>
+        <w:rPr>
+          <w:sz w:val="28"/>
+        </w:rPr>
+      </w:pPr>
+      <w:r>
+        <w:rPr>
+          <w:sz w:val="28"/>
+        </w:rPr>
+        <w:t xml:space="preserve">6. </w:t>
+      </w:r>
+      <w:r>
+        <w:rPr>
+          <w:sz w:val="28"/>
+        </w:rPr>
+        <w:t xml:space="preserve"> </w:t>
+      </w:r>
+      <w:r>
+        <w:rPr>
+          <w:sz w:val="28"/>
+        </w:rPr>
+        <w:t>Look on dynamic pressure indicator from time to time and reduce thrust to keep pressure below 5 tons/square meter limit.</w:t>
+      </w:r>
+    </w:p>
+    <w:p>
+      <w:pPr>
+        <w:pBdr>
+          <w:top w:val="none" w:sz="0" w:space="0" w:color="auto"/>
+          <w:left w:val="none" w:sz="0" w:space="0" w:color="auto"/>
+          <w:bottom w:val="none" w:sz="0" w:space="0" w:color="auto"/>
+          <w:right w:val="none" w:sz="0" w:space="0" w:color="auto"/>
+        </w:pBdr>
+        <w:shd w:val="clear" w:color="auto" w:fill="auto"/>
+        <w:spacing w:after="83" w:line="259" w:lineRule="auto"/>
+        <w:ind w:left="355"/>
+        <w:rPr>
+          <w:sz w:val="28"/>
+        </w:rPr>
+      </w:pPr>
+      <w:r>
+        <w:rPr>
+          <w:sz w:val="28"/>
+        </w:rPr>
+        <w:t xml:space="preserve">7. </w:t>
+      </w:r>
+      <w:r>
+        <w:rPr>
+          <w:sz w:val="28"/>
+        </w:rPr>
+        <w:t xml:space="preserve"> </w:t>
+      </w:r>
+      <w:r>
+        <w:rPr>
+          <w:sz w:val="28"/>
+        </w:rPr>
+        <w:t>Restore thrust with pressure dropping.</w:t>
+      </w:r>
+    </w:p>
+    <w:p>
+      <w:pPr>
+        <w:pBdr>
+          <w:top w:val="none" w:sz="0" w:space="0" w:color="auto"/>
+          <w:left w:val="none" w:sz="0" w:space="0" w:color="auto"/>
+          <w:bottom w:val="none" w:sz="0" w:space="0" w:color="auto"/>
+          <w:right w:val="none" w:sz="0" w:space="0" w:color="auto"/>
+        </w:pBdr>
+        <w:shd w:val="clear" w:color="auto" w:fill="auto"/>
+        <w:spacing w:after="83" w:line="259" w:lineRule="auto"/>
+        <w:ind w:left="355"/>
+        <w:rPr>
+          <w:sz w:val="28"/>
+        </w:rPr>
+      </w:pPr>
+      <w:r>
+        <w:rPr>
+          <w:sz w:val="28"/>
+        </w:rPr>
+        <w:t xml:space="preserve">8. </w:t>
+      </w:r>
+      <w:r>
+        <w:rPr>
+          <w:sz w:val="28"/>
+        </w:rPr>
+        <w:t xml:space="preserve"> </w:t>
+      </w:r>
+      <w:r>
+        <w:rPr>
+          <w:sz w:val="28"/>
+        </w:rPr>
+        <w:t>Continue ascent with pitch angle growing by small amounts continuing for 500m/sec vertical speed stabilizing.</w:t>
+      </w:r>
+    </w:p>
+    <w:p>
+      <w:pPr>
+        <w:pBdr>
+          <w:top w:val="none" w:sz="0" w:space="0" w:color="auto"/>
+          <w:left w:val="none" w:sz="0" w:space="0" w:color="auto"/>
+          <w:bottom w:val="none" w:sz="0" w:space="0" w:color="auto"/>
+          <w:right w:val="none" w:sz="0" w:space="0" w:color="auto"/>
+        </w:pBdr>
+        <w:shd w:val="clear" w:color="auto" w:fill="auto"/>
+        <w:spacing w:after="83" w:line="259" w:lineRule="auto"/>
+        <w:ind w:left="355"/>
+        <w:rPr>
+          <w:sz w:val="28"/>
+        </w:rPr>
+      </w:pPr>
+      <w:r>
+        <w:rPr>
+          <w:sz w:val="28"/>
+        </w:rPr>
+        <w:t xml:space="preserve">9. </w:t>
+      </w:r>
+      <w:r>
+        <w:rPr>
+          <w:sz w:val="28"/>
+        </w:rPr>
+        <w:t xml:space="preserve"> </w:t>
+      </w:r>
+      <w:r>
+        <w:rPr>
+          <w:sz w:val="28"/>
+        </w:rPr>
+        <w:t>Correct yaw angle on need.</w:t>
+      </w:r>
+    </w:p>
+    <w:p>
+      <w:pPr>
+        <w:pBdr>
+          <w:top w:val="none" w:sz="0" w:space="0" w:color="auto"/>
+          <w:left w:val="none" w:sz="0" w:space="0" w:color="auto"/>
+          <w:bottom w:val="none" w:sz="0" w:space="0" w:color="auto"/>
+          <w:right w:val="none" w:sz="0" w:space="0" w:color="auto"/>
+        </w:pBdr>
+        <w:shd w:val="clear" w:color="auto" w:fill="auto"/>
+        <w:spacing w:after="83" w:line="259" w:lineRule="auto"/>
+        <w:ind w:left="355"/>
+        <w:rPr>
+          <w:sz w:val="28"/>
+        </w:rPr>
+      </w:pPr>
+      <w:r>
+        <w:rPr>
+          <w:sz w:val="28"/>
+        </w:rPr>
+        <w:t>10.</w:t>
+      </w:r>
+      <w:r>
+        <w:rPr>
+          <w:sz w:val="28"/>
+        </w:rPr>
+        <w:t xml:space="preserve"> </w:t>
+      </w:r>
+      <w:r>
+        <w:rPr>
+          <w:sz w:val="28"/>
+        </w:rPr>
+        <w:t xml:space="preserve">Check g force indicator and control throttle to preserve g force 4g limit exceeding. </w:t>
+      </w:r>
+    </w:p>
+    <w:p>
+      <w:pPr>
+        <w:pBdr>
+          <w:top w:val="none" w:sz="0" w:space="0" w:color="auto"/>
+          <w:left w:val="none" w:sz="0" w:space="0" w:color="auto"/>
+          <w:bottom w:val="none" w:sz="0" w:space="0" w:color="auto"/>
+          <w:right w:val="none" w:sz="0" w:space="0" w:color="auto"/>
+        </w:pBdr>
+        <w:shd w:val="clear" w:color="auto" w:fill="auto"/>
+        <w:spacing w:after="83" w:line="259" w:lineRule="auto"/>
+        <w:ind w:left="355"/>
+        <w:rPr>
+          <w:sz w:val="28"/>
+        </w:rPr>
+      </w:pPr>
+      <w:r>
+        <w:rPr>
+          <w:sz w:val="28"/>
+        </w:rPr>
+        <w:t>11.</w:t>
+      </w:r>
+      <w:r>
+        <w:rPr>
+          <w:sz w:val="28"/>
+        </w:rPr>
+        <w:t xml:space="preserve"> </w:t>
+      </w:r>
+      <w:r>
+        <w:rPr>
+          <w:sz w:val="28"/>
+        </w:rPr>
+        <w:t>On exhaust of first stage fuel separate it and return throttle to maximum.</w:t>
+      </w:r>
+    </w:p>
+    <w:p>
+      <w:pPr>
+        <w:pBdr>
+          <w:top w:val="none" w:sz="0" w:space="0" w:color="auto"/>
+          <w:left w:val="none" w:sz="0" w:space="0" w:color="auto"/>
+          <w:bottom w:val="none" w:sz="0" w:space="0" w:color="auto"/>
+          <w:right w:val="none" w:sz="0" w:space="0" w:color="auto"/>
+        </w:pBdr>
+        <w:shd w:val="clear" w:color="auto" w:fill="auto"/>
+        <w:spacing w:after="83" w:line="259" w:lineRule="auto"/>
+        <w:ind w:left="355"/>
+        <w:rPr>
+          <w:sz w:val="28"/>
+        </w:rPr>
+      </w:pPr>
+      <w:r>
+        <w:rPr>
+          <w:sz w:val="28"/>
+        </w:rPr>
         <w:t>12.</w:t>
       </w:r>
       <w:r>
@@ -8152,7 +8324,7 @@
         <w:rPr>
           <w:sz w:val="28"/>
         </w:rPr>
-        <w:t>On exhaust of first stage fuel separate it and return throttle to maximum.</w:t>
+        <w:t>Separate fairings on 80km altitude exceeding.</w:t>
       </w:r>
     </w:p>
     <w:p>
@@ -8886,26 +9058,25 @@
         <w:rPr>
           <w:sz w:val="28"/>
         </w:rPr>
+        <w:t xml:space="preserve">you </w:t>
+      </w:r>
+      <w:r>
+        <w:rPr>
+          <w:sz w:val="28"/>
+        </w:rPr>
         <w:t xml:space="preserve">a </w:t>
       </w:r>
       <w:r>
         <w:rPr>
           <w:sz w:val="28"/>
         </w:rPr>
-        <w:t xml:space="preserve">safe landing for </w:t>
-      </w:r>
-      <w:r>
-        <w:rPr>
-          <w:rFonts w:asciiTheme="minorEastAsia" w:eastAsiaTheme="minorEastAsia" w:hAnsiTheme="minorEastAsia" w:hint="eastAsia"/>
-          <w:sz w:val="28"/>
-        </w:rPr>
-        <w:t>y</w:t>
-      </w:r>
-      <w:r>
-        <w:rPr>
-          <w:sz w:val="28"/>
-        </w:rPr>
-        <w:t>ou.</w:t>
+        <w:t>safe landing</w:t>
+      </w:r>
+      <w:r>
+        <w:rPr>
+          <w:sz w:val="28"/>
+        </w:rPr>
+        <w:t>.</w:t>
       </w:r>
     </w:p>
     <w:sectPr>
@@ -9007,7 +9178,7 @@
       <w:rPr>
         <w:noProof/>
       </w:rPr>
-      <w:t>2</w:t>
+      <w:t>9</w:t>
     </w:r>
     <w:r>
       <w:fldChar w:fldCharType="end"/>
@@ -9112,7 +9283,7 @@
       <w:rPr>
         <w:noProof/>
       </w:rPr>
-      <w:t>10</w:t>
+      <w:t>24</w:t>
     </w:r>
     <w:r>
       <w:fldChar w:fldCharType="end"/>

</xml_diff>